<commit_message>
Bütün çıktıları yeniden derle (16 hafta)
Bu turdaki içerik ve diyagram değişikliklerinden sonra tüm dağıtım
dosyaları tazelendi: 16 sunum HTML + 16 sunum PDF + 16 PPTX,
16 ders notu PDF + 16 DOCX, 16 materyal paketi (TR ve EN).

Doğrulama: 144 çıktının hepsi taze; H1/H9/H14 örneklerinde PPTX ve DOCX
içine görseller gömülmüş, not PDF'inde diyagramlar vektör olarak basılmış
(SVG olduğu için raster sayımında görünmez), slayt PDF'inde sayfa
düzeni ve altbilgi yerinde.

Co-Authored-By: Claude Opus 5 (1M context) <noreply@anthropic.com>
</commit_message>
<xml_diff>
--- a/docs/week-1/cen429-week-1-ders-notu.en.docx
+++ b/docs/week-1/cen429-week-1-ders-notu.en.docx
@@ -2,7 +2,7 @@
 <file path=word/document.xml><?xml version="1.0" encoding="utf-8"?>
 <w:document xmlns:w="http://schemas.openxmlformats.org/wordprocessingml/2006/main" xmlns:m="http://schemas.openxmlformats.org/officeDocument/2006/math" xmlns:r="http://schemas.openxmlformats.org/officeDocument/2006/relationships" xmlns:o="urn:schemas-microsoft-com:office:office" xmlns:v="urn:schemas-microsoft-com:vml" xmlns:w10="urn:schemas-microsoft-com:office:word" xmlns:a="http://schemas.openxmlformats.org/drawingml/2006/main" xmlns:pic="http://schemas.openxmlformats.org/drawingml/2006/picture" xmlns:wp="http://schemas.openxmlformats.org/drawingml/2006/wordprocessingDrawing">
   <w:body>
-    <w:bookmarkStart w:id="163" w:name="X631521b453af8a881ffc146b84a1ada6c43025b"/>
+    <w:bookmarkStart w:id="175" w:name="X631521b453af8a881ffc146b84a1ada6c43025b"/>
     <w:p>
       <w:pPr>
         <w:pStyle w:val="Heading1"/>
@@ -25915,7 +25915,7 @@
     </w:p>
     <w:bookmarkEnd w:id="110"/>
     <w:bookmarkEnd w:id="111"/>
-    <w:bookmarkStart w:id="112" w:name="süreç-belleği-verileriniz-nerede-duruyor"/>
+    <w:bookmarkStart w:id="118" w:name="süreç-belleği-verileriniz-nerede-duruyor"/>
     <w:p>
       <w:pPr>
         <w:pStyle w:val="Heading2"/>
@@ -25940,139 +25940,241 @@
     </w:p>
     <w:p>
       <w:pPr>
+        <w:pStyle w:val="BodyText"/>
+      </w:pPr>
+      <w:r>
+        <w:drawing>
+          <wp:inline>
+            <wp:extent cx="5759999" cy="3235916"/>
+            <wp:effectExtent b="0" l="0" r="0" t="0"/>
+            <wp:docPr descr="Süreç belleği: yığın, öbek, BSS/data ve kod bölgeleri" title="" id="113" name="Picture"/>
+            <a:graphic>
+              <a:graphicData uri="http://schemas.openxmlformats.org/drawingml/2006/picture">
+                <pic:pic>
+                  <pic:nvPicPr>
+                    <pic:cNvPr descr="h01-13-surec-bellegi.png" id="114" name="Picture"/>
+                    <pic:cNvPicPr>
+                      <a:picLocks noChangeArrowheads="1" noChangeAspect="1"/>
+                    </pic:cNvPicPr>
+                  </pic:nvPicPr>
+                  <pic:blipFill>
+                    <a:blip r:embed="rId112"/>
+                    <a:stretch>
+                      <a:fillRect/>
+                    </a:stretch>
+                  </pic:blipFill>
+                  <pic:spPr bwMode="auto">
+                    <a:xfrm>
+                      <a:off x="0" y="0"/>
+                      <a:ext cx="5759999" cy="3235916"/>
+                    </a:xfrm>
+                    <a:prstGeom prst="rect">
+                      <a:avLst/>
+                    </a:prstGeom>
+                    <a:noFill/>
+                    <a:ln w="9525">
+                      <a:noFill/>
+                      <a:headEnd/>
+                      <a:tailEnd/>
+                    </a:ln>
+                  </pic:spPr>
+                </pic:pic>
+              </a:graphicData>
+            </a:graphic>
+          </wp:inline>
+        </w:drawing>
+      </w:r>
+    </w:p>
+    <w:p>
+      <w:pPr>
+        <w:pStyle w:val="BodyText"/>
+      </w:pPr>
+      <w:r>
+        <w:t xml:space="preserve">Bir fonksiyon çağrıldığında yığında ona bir</w:t>
+      </w:r>
+      <w:r>
+        <w:t xml:space="preserve"> </w:t>
+      </w:r>
+      <w:r>
+        <w:rPr>
+          <w:b/>
+          <w:bCs/>
+        </w:rPr>
+        <w:t xml:space="preserve">çerçeve</w:t>
+      </w:r>
+      <w:r>
+        <w:t xml:space="preserve"> </w:t>
+      </w:r>
+      <w:r>
+        <w:t xml:space="preserve">(stack frame) ayrılır. Yerel değişkenler, bu çerçevede</w:t>
+      </w:r>
+      <w:r>
+        <w:t xml:space="preserve"> </w:t>
+      </w:r>
+      <w:r>
+        <w:rPr>
+          <w:b/>
+          <w:bCs/>
+        </w:rPr>
+        <w:t xml:space="preserve">yan yana</w:t>
+      </w:r>
+      <w:r>
+        <w:t xml:space="preserve"> </w:t>
+      </w:r>
+      <w:r>
+        <w:t xml:space="preserve">durur. C, bir dizinin sonuna gelindiğini</w:t>
+      </w:r>
+      <w:r>
+        <w:t xml:space="preserve"> </w:t>
+      </w:r>
+      <w:r>
+        <w:rPr>
+          <w:b/>
+          <w:bCs/>
+        </w:rPr>
+        <w:t xml:space="preserve">denetlemez</w:t>
+      </w:r>
+      <w:r>
+        <w:t xml:space="preserve">:</w:t>
+      </w:r>
+      <w:r>
+        <w:t xml:space="preserve"> </w:t>
+      </w:r>
+      <w:r>
+        <w:rPr>
+          <w:rStyle w:val="VerbatimChar"/>
+        </w:rPr>
+        <w:t xml:space="preserve">ad[16]</w:t>
+      </w:r>
+      <w:r>
+        <w:t xml:space="preserve"> </w:t>
+      </w:r>
+      <w:r>
+        <w:t xml:space="preserve">dizisine 17. baytı yazarsanız, C bunu</w:t>
+      </w:r>
+      <w:r>
+        <w:t xml:space="preserve"> </w:t>
+      </w:r>
+      <w:r>
+        <w:t xml:space="preserve">engellemez ve o bayt bellekte hemen arkada ne varsa onun üzerine yazılır.</w:t>
+      </w:r>
+    </w:p>
+    <w:p>
+      <w:pPr>
+        <w:pStyle w:val="BodyText"/>
+      </w:pPr>
+      <w:r>
+        <w:t xml:space="preserve">Demo 3’teki yapıya bakalım:</w:t>
+      </w:r>
+    </w:p>
+    <w:p>
+      <w:pPr>
         <w:pStyle w:val="SourceCode"/>
       </w:pPr>
       <w:r>
         <w:rPr>
-          <w:rStyle w:val="VerbatimChar"/>
-        </w:rPr>
-        <w:t xml:space="preserve"> yüksek adres</w:t>
+          <w:rStyle w:val="KeywordTok"/>
+        </w:rPr>
+        <w:t xml:space="preserve">struct</w:t>
+      </w:r>
+      <w:r>
+        <w:rPr>
+          <w:rStyle w:val="NormalTok"/>
+        </w:rPr>
+        <w:t xml:space="preserve"> oturum </w:t>
+      </w:r>
+      <w:r>
+        <w:rPr>
+          <w:rStyle w:val="OperatorTok"/>
+        </w:rPr>
+        <w:t xml:space="preserve">{</w:t>
       </w:r>
       <w:r>
         <w:br/>
       </w:r>
       <w:r>
         <w:rPr>
-          <w:rStyle w:val="VerbatimChar"/>
-        </w:rPr>
-        <w:t xml:space="preserve"> +-----------------+</w:t>
+          <w:rStyle w:val="NormalTok"/>
+        </w:rPr>
+        <w:t xml:space="preserve">    </w:t>
+      </w:r>
+      <w:r>
+        <w:rPr>
+          <w:rStyle w:val="DataTypeTok"/>
+        </w:rPr>
+        <w:t xml:space="preserve">char</w:t>
+      </w:r>
+      <w:r>
+        <w:rPr>
+          <w:rStyle w:val="NormalTok"/>
+        </w:rPr>
+        <w:t xml:space="preserve"> ad</w:t>
+      </w:r>
+      <w:r>
+        <w:rPr>
+          <w:rStyle w:val="OperatorTok"/>
+        </w:rPr>
+        <w:t xml:space="preserve">[</w:t>
+      </w:r>
+      <w:r>
+        <w:rPr>
+          <w:rStyle w:val="DecValTok"/>
+        </w:rPr>
+        <w:t xml:space="preserve">16</w:t>
+      </w:r>
+      <w:r>
+        <w:rPr>
+          <w:rStyle w:val="OperatorTok"/>
+        </w:rPr>
+        <w:t xml:space="preserve">];</w:t>
       </w:r>
       <w:r>
         <w:br/>
       </w:r>
       <w:r>
         <w:rPr>
-          <w:rStyle w:val="VerbatimChar"/>
-        </w:rPr>
-        <w:t xml:space="preserve"> | Yığın (stack)   |  &lt;- yerel değişkenler, dönüş adresleri</w:t>
+          <w:rStyle w:val="NormalTok"/>
+        </w:rPr>
+        <w:t xml:space="preserve">    </w:t>
+      </w:r>
+      <w:r>
+        <w:rPr>
+          <w:rStyle w:val="DataTypeTok"/>
+        </w:rPr>
+        <w:t xml:space="preserve">int</w:t>
+      </w:r>
+      <w:r>
+        <w:rPr>
+          <w:rStyle w:val="NormalTok"/>
+        </w:rPr>
+        <w:t xml:space="preserve">  yonetici</w:t>
+      </w:r>
+      <w:r>
+        <w:rPr>
+          <w:rStyle w:val="OperatorTok"/>
+        </w:rPr>
+        <w:t xml:space="preserve">;</w:t>
+      </w:r>
+      <w:r>
+        <w:rPr>
+          <w:rStyle w:val="NormalTok"/>
+        </w:rPr>
+        <w:t xml:space="preserve">   </w:t>
+      </w:r>
+      <w:r>
+        <w:rPr>
+          <w:rStyle w:val="CommentTok"/>
+        </w:rPr>
+        <w:t xml:space="preserve">/* 0 = normal kullanıcı */</w:t>
       </w:r>
       <w:r>
         <w:br/>
       </w:r>
       <w:r>
         <w:rPr>
-          <w:rStyle w:val="VerbatimChar"/>
-        </w:rPr>
-        <w:t xml:space="preserve"> |       |         |     (aşağı doğru büyür)</w:t>
-      </w:r>
-      <w:r>
-        <w:br/>
-      </w:r>
-      <w:r>
-        <w:rPr>
-          <w:rStyle w:val="VerbatimChar"/>
-        </w:rPr>
-        <w:t xml:space="preserve"> |       v         |</w:t>
-      </w:r>
-      <w:r>
-        <w:br/>
-      </w:r>
-      <w:r>
-        <w:rPr>
-          <w:rStyle w:val="VerbatimChar"/>
-        </w:rPr>
-        <w:t xml:space="preserve"> |                 |</w:t>
-      </w:r>
-      <w:r>
-        <w:br/>
-      </w:r>
-      <w:r>
-        <w:rPr>
-          <w:rStyle w:val="VerbatimChar"/>
-        </w:rPr>
-        <w:t xml:space="preserve"> |       ^         |</w:t>
-      </w:r>
-      <w:r>
-        <w:br/>
-      </w:r>
-      <w:r>
-        <w:rPr>
-          <w:rStyle w:val="VerbatimChar"/>
-        </w:rPr>
-        <w:t xml:space="preserve"> |       |         |</w:t>
-      </w:r>
-      <w:r>
-        <w:br/>
-      </w:r>
-      <w:r>
-        <w:rPr>
-          <w:rStyle w:val="VerbatimChar"/>
-        </w:rPr>
-        <w:t xml:space="preserve"> | Öbek (heap)     |  &lt;- malloc ile alınan bellek</w:t>
-      </w:r>
-      <w:r>
-        <w:br/>
-      </w:r>
-      <w:r>
-        <w:rPr>
-          <w:rStyle w:val="VerbatimChar"/>
-        </w:rPr>
-        <w:t xml:space="preserve"> +-----------------+     (yukarı doğru büyür)</w:t>
-      </w:r>
-      <w:r>
-        <w:br/>
-      </w:r>
-      <w:r>
-        <w:rPr>
-          <w:rStyle w:val="VerbatimChar"/>
-        </w:rPr>
-        <w:t xml:space="preserve"> | .bss / .data    |  &lt;- küresel ve static değişkenler</w:t>
-      </w:r>
-      <w:r>
-        <w:br/>
-      </w:r>
-      <w:r>
-        <w:rPr>
-          <w:rStyle w:val="VerbatimChar"/>
-        </w:rPr>
-        <w:t xml:space="preserve"> +-----------------+</w:t>
-      </w:r>
-      <w:r>
-        <w:br/>
-      </w:r>
-      <w:r>
-        <w:rPr>
-          <w:rStyle w:val="VerbatimChar"/>
-        </w:rPr>
-        <w:t xml:space="preserve"> | .text           |  &lt;- makine kodu (salt okunur)</w:t>
-      </w:r>
-      <w:r>
-        <w:br/>
-      </w:r>
-      <w:r>
-        <w:rPr>
-          <w:rStyle w:val="VerbatimChar"/>
-        </w:rPr>
-        <w:t xml:space="preserve"> +-----------------+</w:t>
-      </w:r>
-      <w:r>
-        <w:br/>
-      </w:r>
-      <w:r>
-        <w:rPr>
-          <w:rStyle w:val="VerbatimChar"/>
-        </w:rPr>
-        <w:t xml:space="preserve"> düşük adres</w:t>
+          <w:rStyle w:val="OperatorTok"/>
+        </w:rPr>
+        <w:t xml:space="preserve">};</w:t>
       </w:r>
     </w:p>
     <w:p>
@@ -26080,300 +26182,51 @@
         <w:pStyle w:val="FirstParagraph"/>
       </w:pPr>
       <w:r>
-        <w:t xml:space="preserve">Bir fonksiyon çağrıldığında yığında ona bir</w:t>
-      </w:r>
-      <w:r>
-        <w:t xml:space="preserve"> </w:t>
-      </w:r>
-      <w:r>
-        <w:rPr>
-          <w:b/>
-          <w:bCs/>
-        </w:rPr>
-        <w:t xml:space="preserve">çerçeve</w:t>
-      </w:r>
-      <w:r>
-        <w:t xml:space="preserve"> </w:t>
-      </w:r>
-      <w:r>
-        <w:t xml:space="preserve">(stack frame) ayrılır. Yerel değişkenler, bu çerçevede</w:t>
-      </w:r>
-      <w:r>
-        <w:t xml:space="preserve"> </w:t>
-      </w:r>
-      <w:r>
-        <w:rPr>
-          <w:b/>
-          <w:bCs/>
-        </w:rPr>
-        <w:t xml:space="preserve">yan yana</w:t>
-      </w:r>
-      <w:r>
-        <w:t xml:space="preserve"> </w:t>
-      </w:r>
-      <w:r>
-        <w:t xml:space="preserve">durur. C, bir dizinin sonuna gelindiğini</w:t>
-      </w:r>
-      <w:r>
-        <w:t xml:space="preserve"> </w:t>
-      </w:r>
-      <w:r>
-        <w:rPr>
-          <w:b/>
-          <w:bCs/>
-        </w:rPr>
-        <w:t xml:space="preserve">denetlemez</w:t>
-      </w:r>
-      <w:r>
-        <w:t xml:space="preserve">:</w:t>
-      </w:r>
-      <w:r>
-        <w:t xml:space="preserve"> </w:t>
-      </w:r>
-      <w:r>
-        <w:rPr>
-          <w:rStyle w:val="VerbatimChar"/>
-        </w:rPr>
-        <w:t xml:space="preserve">ad[16]</w:t>
-      </w:r>
-      <w:r>
-        <w:t xml:space="preserve"> </w:t>
-      </w:r>
-      <w:r>
-        <w:t xml:space="preserve">dizisine 17. baytı yazarsanız, C bunu</w:t>
-      </w:r>
-      <w:r>
-        <w:t xml:space="preserve"> </w:t>
-      </w:r>
-      <w:r>
-        <w:t xml:space="preserve">engellemez ve o bayt bellekte hemen arkada ne varsa onun üzerine yazılır.</w:t>
+        <w:drawing>
+          <wp:inline>
+            <wp:extent cx="5759999" cy="2470728"/>
+            <wp:effectExtent b="0" l="0" r="0" t="0"/>
+            <wp:docPr descr="Taşmadan önce ve sonra ad(16) dizisi ile yonetici alanının bellekteki hâli" title="" id="116" name="Picture"/>
+            <a:graphic>
+              <a:graphicData uri="http://schemas.openxmlformats.org/drawingml/2006/picture">
+                <pic:pic>
+                  <pic:nvPicPr>
+                    <pic:cNvPr descr="h01-14-yapi-bellekte.png" id="117" name="Picture"/>
+                    <pic:cNvPicPr>
+                      <a:picLocks noChangeArrowheads="1" noChangeAspect="1"/>
+                    </pic:cNvPicPr>
+                  </pic:nvPicPr>
+                  <pic:blipFill>
+                    <a:blip r:embed="rId115"/>
+                    <a:stretch>
+                      <a:fillRect/>
+                    </a:stretch>
+                  </pic:blipFill>
+                  <pic:spPr bwMode="auto">
+                    <a:xfrm>
+                      <a:off x="0" y="0"/>
+                      <a:ext cx="5759999" cy="2470728"/>
+                    </a:xfrm>
+                    <a:prstGeom prst="rect">
+                      <a:avLst/>
+                    </a:prstGeom>
+                    <a:noFill/>
+                    <a:ln w="9525">
+                      <a:noFill/>
+                      <a:headEnd/>
+                      <a:tailEnd/>
+                    </a:ln>
+                  </pic:spPr>
+                </pic:pic>
+              </a:graphicData>
+            </a:graphic>
+          </wp:inline>
+        </w:drawing>
       </w:r>
     </w:p>
     <w:p>
       <w:pPr>
         <w:pStyle w:val="BodyText"/>
-      </w:pPr>
-      <w:r>
-        <w:t xml:space="preserve">Demo 3’teki yapıya bakalım:</w:t>
-      </w:r>
-    </w:p>
-    <w:p>
-      <w:pPr>
-        <w:pStyle w:val="SourceCode"/>
-      </w:pPr>
-      <w:r>
-        <w:rPr>
-          <w:rStyle w:val="KeywordTok"/>
-        </w:rPr>
-        <w:t xml:space="preserve">struct</w:t>
-      </w:r>
-      <w:r>
-        <w:rPr>
-          <w:rStyle w:val="NormalTok"/>
-        </w:rPr>
-        <w:t xml:space="preserve"> oturum </w:t>
-      </w:r>
-      <w:r>
-        <w:rPr>
-          <w:rStyle w:val="OperatorTok"/>
-        </w:rPr>
-        <w:t xml:space="preserve">{</w:t>
-      </w:r>
-      <w:r>
-        <w:br/>
-      </w:r>
-      <w:r>
-        <w:rPr>
-          <w:rStyle w:val="NormalTok"/>
-        </w:rPr>
-        <w:t xml:space="preserve">    </w:t>
-      </w:r>
-      <w:r>
-        <w:rPr>
-          <w:rStyle w:val="DataTypeTok"/>
-        </w:rPr>
-        <w:t xml:space="preserve">char</w:t>
-      </w:r>
-      <w:r>
-        <w:rPr>
-          <w:rStyle w:val="NormalTok"/>
-        </w:rPr>
-        <w:t xml:space="preserve"> ad</w:t>
-      </w:r>
-      <w:r>
-        <w:rPr>
-          <w:rStyle w:val="OperatorTok"/>
-        </w:rPr>
-        <w:t xml:space="preserve">[</w:t>
-      </w:r>
-      <w:r>
-        <w:rPr>
-          <w:rStyle w:val="DecValTok"/>
-        </w:rPr>
-        <w:t xml:space="preserve">16</w:t>
-      </w:r>
-      <w:r>
-        <w:rPr>
-          <w:rStyle w:val="OperatorTok"/>
-        </w:rPr>
-        <w:t xml:space="preserve">];</w:t>
-      </w:r>
-      <w:r>
-        <w:br/>
-      </w:r>
-      <w:r>
-        <w:rPr>
-          <w:rStyle w:val="NormalTok"/>
-        </w:rPr>
-        <w:t xml:space="preserve">    </w:t>
-      </w:r>
-      <w:r>
-        <w:rPr>
-          <w:rStyle w:val="DataTypeTok"/>
-        </w:rPr>
-        <w:t xml:space="preserve">int</w:t>
-      </w:r>
-      <w:r>
-        <w:rPr>
-          <w:rStyle w:val="NormalTok"/>
-        </w:rPr>
-        <w:t xml:space="preserve">  yonetici</w:t>
-      </w:r>
-      <w:r>
-        <w:rPr>
-          <w:rStyle w:val="OperatorTok"/>
-        </w:rPr>
-        <w:t xml:space="preserve">;</w:t>
-      </w:r>
-      <w:r>
-        <w:rPr>
-          <w:rStyle w:val="NormalTok"/>
-        </w:rPr>
-        <w:t xml:space="preserve">   </w:t>
-      </w:r>
-      <w:r>
-        <w:rPr>
-          <w:rStyle w:val="CommentTok"/>
-        </w:rPr>
-        <w:t xml:space="preserve">/* 0 = normal kullanıcı */</w:t>
-      </w:r>
-      <w:r>
-        <w:br/>
-      </w:r>
-      <w:r>
-        <w:rPr>
-          <w:rStyle w:val="OperatorTok"/>
-        </w:rPr>
-        <w:t xml:space="preserve">};</w:t>
-      </w:r>
-    </w:p>
-    <w:p>
-      <w:pPr>
-        <w:pStyle w:val="SourceCode"/>
-      </w:pPr>
-      <w:r>
-        <w:rPr>
-          <w:rStyle w:val="VerbatimChar"/>
-        </w:rPr>
-        <w:t xml:space="preserve"> ofset    0  1  2  3  4  5  6  7  8  9 10 11 12 13 14 15   16 17 18 19</w:t>
-      </w:r>
-      <w:r>
-        <w:br/>
-      </w:r>
-      <w:r>
-        <w:rPr>
-          <w:rStyle w:val="VerbatimChar"/>
-        </w:rPr>
-        <w:t xml:space="preserve">         +-----------------------------------------------+ +-----------+</w:t>
-      </w:r>
-      <w:r>
-        <w:br/>
-      </w:r>
-      <w:r>
-        <w:rPr>
-          <w:rStyle w:val="VerbatimChar"/>
-        </w:rPr>
-        <w:t xml:space="preserve"> önce    | a  y  s  e \0  .  .  .  .  .  .  .  .  .  .  .| |00 00 00 00|</w:t>
-      </w:r>
-      <w:r>
-        <w:br/>
-      </w:r>
-      <w:r>
-        <w:rPr>
-          <w:rStyle w:val="VerbatimChar"/>
-        </w:rPr>
-        <w:t xml:space="preserve">         +-----------------------------------------------+ +-----------+</w:t>
-      </w:r>
-      <w:r>
-        <w:br/>
-      </w:r>
-      <w:r>
-        <w:rPr>
-          <w:rStyle w:val="VerbatimChar"/>
-        </w:rPr>
-        <w:t xml:space="preserve">          &lt;------------------ ad[16] -------------------&gt;   yonetici=0</w:t>
-      </w:r>
-      <w:r>
-        <w:br/>
-      </w:r>
-      <w:r>
-        <w:br/>
-      </w:r>
-      <w:r>
-        <w:rPr>
-          <w:rStyle w:val="VerbatimChar"/>
-        </w:rPr>
-        <w:t xml:space="preserve"> 17 karakterlik "AAAAAAAAAAAAAAAAB" kopyalanınca:</w:t>
-      </w:r>
-      <w:r>
-        <w:br/>
-      </w:r>
-      <w:r>
-        <w:rPr>
-          <w:rStyle w:val="VerbatimChar"/>
-        </w:rPr>
-        <w:t xml:space="preserve">         +-----------------------------------------------+ +-----------+</w:t>
-      </w:r>
-      <w:r>
-        <w:br/>
-      </w:r>
-      <w:r>
-        <w:rPr>
-          <w:rStyle w:val="VerbatimChar"/>
-        </w:rPr>
-        <w:t xml:space="preserve"> sonra   | A  A  A  A  A  A  A  A  A  A  A  A  A  A  A  A| |42 00 00 00|</w:t>
-      </w:r>
-      <w:r>
-        <w:br/>
-      </w:r>
-      <w:r>
-        <w:rPr>
-          <w:rStyle w:val="VerbatimChar"/>
-        </w:rPr>
-        <w:t xml:space="preserve">         +-----------------------------------------------+ +-----------+</w:t>
-      </w:r>
-      <w:r>
-        <w:br/>
-      </w:r>
-      <w:r>
-        <w:rPr>
-          <w:rStyle w:val="VerbatimChar"/>
-        </w:rPr>
-        <w:t xml:space="preserve">                                                   'B' ve '\0' ^^ ^^</w:t>
-      </w:r>
-      <w:r>
-        <w:br/>
-      </w:r>
-      <w:r>
-        <w:rPr>
-          <w:rStyle w:val="VerbatimChar"/>
-        </w:rPr>
-        <w:t xml:space="preserve">                                                    yonetici = 0x42 = 66</w:t>
-      </w:r>
-    </w:p>
-    <w:p>
-      <w:pPr>
-        <w:pStyle w:val="FirstParagraph"/>
       </w:pPr>
       <w:r>
         <w:t xml:space="preserve">x86-64 işlemciler</w:t>
@@ -26447,8 +26300,8 @@
         </w:pict>
       </w:r>
     </w:p>
-    <w:bookmarkEnd w:id="112"/>
-    <w:bookmarkStart w:id="121" w:name="Xfcbcec7f34fe3a83aa2dacda71cc80695d4b888"/>
+    <w:bookmarkEnd w:id="118"/>
+    <w:bookmarkStart w:id="130" w:name="Xfcbcec7f34fe3a83aa2dacda71cc80695d4b888"/>
     <w:p>
       <w:pPr>
         <w:pStyle w:val="Heading2"/>
@@ -26537,7 +26390,7 @@
         <w:t xml:space="preserve">(CWE-787) yıllardır ilk sıralardadır.</w:t>
       </w:r>
     </w:p>
-    <w:bookmarkStart w:id="113" w:name="c-neden-bu-kadar-kolay-taşar"/>
+    <w:bookmarkStart w:id="119" w:name="c-neden-bu-kadar-kolay-taşar"/>
     <w:p>
       <w:pPr>
         <w:pStyle w:val="Heading3"/>
@@ -26783,8 +26636,8 @@
         <w:t xml:space="preserve">sorumluluğundadır. Programcı bir kez unutursa, hata oradadır.</w:t>
       </w:r>
     </w:p>
-    <w:bookmarkEnd w:id="113"/>
-    <w:bookmarkStart w:id="114" w:name="yığında-bir-taşma-adım-adım"/>
+    <w:bookmarkEnd w:id="119"/>
+    <w:bookmarkStart w:id="123" w:name="yığında-bir-taşma-adım-adım"/>
     <w:p>
       <w:pPr>
         <w:pStyle w:val="Heading3"/>
@@ -27230,117 +27083,54 @@
     </w:p>
     <w:p>
       <w:pPr>
-        <w:pStyle w:val="SourceCode"/>
-      </w:pPr>
-      <w:r>
-        <w:rPr>
-          <w:rStyle w:val="VerbatimChar"/>
-        </w:rPr>
-        <w:t xml:space="preserve">  düşük adres</w:t>
-      </w:r>
-      <w:r>
-        <w:br/>
-      </w:r>
-      <w:r>
-        <w:rPr>
-          <w:rStyle w:val="VerbatimChar"/>
-        </w:rPr>
-        <w:t xml:space="preserve">  +-----------------------+</w:t>
-      </w:r>
-      <w:r>
-        <w:br/>
-      </w:r>
-      <w:r>
-        <w:rPr>
-          <w:rStyle w:val="VerbatimChar"/>
-        </w:rPr>
-        <w:t xml:space="preserve">  | tampon[0..15]         |  &lt;- strcpy buraya yazmaya başlar ve yukarıdan aşağı ilerler</w:t>
-      </w:r>
-      <w:r>
-        <w:br/>
-      </w:r>
-      <w:r>
-        <w:rPr>
-          <w:rStyle w:val="VerbatimChar"/>
-        </w:rPr>
-        <w:t xml:space="preserve">  +-----------------------+</w:t>
-      </w:r>
-      <w:r>
-        <w:br/>
-      </w:r>
-      <w:r>
-        <w:rPr>
-          <w:rStyle w:val="VerbatimChar"/>
-        </w:rPr>
-        <w:t xml:space="preserve">  | yetkili (int)         |  &lt;- 16 bayttan sonrası buraya taşar</w:t>
-      </w:r>
-      <w:r>
-        <w:br/>
-      </w:r>
-      <w:r>
-        <w:rPr>
-          <w:rStyle w:val="VerbatimChar"/>
-        </w:rPr>
-        <w:t xml:space="preserve">  +-----------------------+</w:t>
-      </w:r>
-      <w:r>
-        <w:br/>
-      </w:r>
-      <w:r>
-        <w:rPr>
-          <w:rStyle w:val="VerbatimChar"/>
-        </w:rPr>
-        <w:t xml:space="preserve">  | kaydedilmiş çerçeve   |</w:t>
-      </w:r>
-      <w:r>
-        <w:br/>
-      </w:r>
-      <w:r>
-        <w:rPr>
-          <w:rStyle w:val="VerbatimChar"/>
-        </w:rPr>
-        <w:t xml:space="preserve">  +-----------------------+</w:t>
-      </w:r>
-      <w:r>
-        <w:br/>
-      </w:r>
-      <w:r>
-        <w:rPr>
-          <w:rStyle w:val="VerbatimChar"/>
-        </w:rPr>
-        <w:t xml:space="preserve">  | dönüş adresi          |  &lt;- daha fazlası buraya taşar</w:t>
-      </w:r>
-      <w:r>
-        <w:br/>
-      </w:r>
-      <w:r>
-        <w:rPr>
-          <w:rStyle w:val="VerbatimChar"/>
-        </w:rPr>
-        <w:t xml:space="preserve">  +-----------------------+</w:t>
-      </w:r>
-      <w:r>
-        <w:br/>
-      </w:r>
-      <w:r>
-        <w:rPr>
-          <w:rStyle w:val="VerbatimChar"/>
-        </w:rPr>
-        <w:t xml:space="preserve">  | çağıranın çerçevesi   |</w:t>
-      </w:r>
-      <w:r>
-        <w:br/>
-      </w:r>
-      <w:r>
-        <w:rPr>
-          <w:rStyle w:val="VerbatimChar"/>
-        </w:rPr>
-        <w:t xml:space="preserve">  yüksek adres</w:t>
-      </w:r>
-    </w:p>
-    <w:p>
-      <w:pPr>
-        <w:pStyle w:val="FirstParagraph"/>
+        <w:pStyle w:val="BodyText"/>
+      </w:pPr>
+      <w:r>
+        <w:drawing>
+          <wp:inline>
+            <wp:extent cx="5759999" cy="2888214"/>
+            <wp:effectExtent b="0" l="0" r="0" t="0"/>
+            <wp:docPr descr="Yığın çerçevesinde taşmanın sırayla ezdiği alanlar" title="" id="121" name="Picture"/>
+            <a:graphic>
+              <a:graphicData uri="http://schemas.openxmlformats.org/drawingml/2006/picture">
+                <pic:pic>
+                  <pic:nvPicPr>
+                    <pic:cNvPr descr="h01-15-yiginda-tasma.png" id="122" name="Picture"/>
+                    <pic:cNvPicPr>
+                      <a:picLocks noChangeArrowheads="1" noChangeAspect="1"/>
+                    </pic:cNvPicPr>
+                  </pic:nvPicPr>
+                  <pic:blipFill>
+                    <a:blip r:embed="rId120"/>
+                    <a:stretch>
+                      <a:fillRect/>
+                    </a:stretch>
+                  </pic:blipFill>
+                  <pic:spPr bwMode="auto">
+                    <a:xfrm>
+                      <a:off x="0" y="0"/>
+                      <a:ext cx="5759999" cy="2888214"/>
+                    </a:xfrm>
+                    <a:prstGeom prst="rect">
+                      <a:avLst/>
+                    </a:prstGeom>
+                    <a:noFill/>
+                    <a:ln w="9525">
+                      <a:noFill/>
+                      <a:headEnd/>
+                      <a:tailEnd/>
+                    </a:ln>
+                  </pic:spPr>
+                </pic:pic>
+              </a:graphicData>
+            </a:graphic>
+          </wp:inline>
+        </w:drawing>
+      </w:r>
+    </w:p>
+    <w:p>
+      <w:pPr>
+        <w:pStyle w:val="BodyText"/>
       </w:pPr>
       <w:r>
         <w:t xml:space="preserve">Üç durum vardır:</w:t>
@@ -27664,8 +27454,8 @@
         <w:t xml:space="preserve">ilgileniyoruz.</w:t>
       </w:r>
     </w:p>
-    <w:bookmarkEnd w:id="114"/>
-    <w:bookmarkStart w:id="115" w:name="taşma-türleri"/>
+    <w:bookmarkEnd w:id="123"/>
+    <w:bookmarkStart w:id="124" w:name="taşma-türleri"/>
     <w:p>
       <w:pPr>
         <w:pStyle w:val="Heading3"/>
@@ -28212,8 +28002,8 @@
         <w:t xml:space="preserve">“bildirilen uzunluk, alınan kayıt uzunluğundan büyükse mesajı at.”</w:t>
       </w:r>
     </w:p>
-    <w:bookmarkEnd w:id="115"/>
-    <w:bookmarkStart w:id="116" w:name="bir-fazla-hatası-en-masum-görünen-taşma"/>
+    <w:bookmarkEnd w:id="124"/>
+    <w:bookmarkStart w:id="125" w:name="bir-fazla-hatası-en-masum-görünen-taşma"/>
     <w:p>
       <w:pPr>
         <w:pStyle w:val="Heading3"/>
@@ -28672,8 +28462,8 @@
         <w:t xml:space="preserve">düşük baytını ya da kaydedilmiş çerçeve adresini değiştirmeye yeter.</w:t>
       </w:r>
     </w:p>
-    <w:bookmarkEnd w:id="116"/>
-    <w:bookmarkStart w:id="117" w:name="X44847281e06e9571eda0ea26d2817b164e5e37c"/>
+    <w:bookmarkEnd w:id="125"/>
+    <w:bookmarkStart w:id="126" w:name="X44847281e06e9571eda0ea26d2817b164e5e37c"/>
     <w:p>
       <w:pPr>
         <w:pStyle w:val="Heading3"/>
@@ -29512,8 +29302,8 @@
         <w:t xml:space="preserve">de projenizde aynı yöntemi kullanabilirsiniz.</w:t>
       </w:r>
     </w:p>
-    <w:bookmarkEnd w:id="117"/>
-    <w:bookmarkStart w:id="118" w:name="Xac7594e28ac053dda6b1010b6bbfb311689e3ac"/>
+    <w:bookmarkEnd w:id="126"/>
+    <w:bookmarkStart w:id="127" w:name="Xac7594e28ac053dda6b1010b6bbfb311689e3ac"/>
     <w:p>
       <w:pPr>
         <w:pStyle w:val="Heading3"/>
@@ -30694,8 +30484,8 @@
         <w:t xml:space="preserve">düşünmekten muaf tutmaz.</w:t>
       </w:r>
     </w:p>
-    <w:bookmarkEnd w:id="118"/>
-    <w:bookmarkStart w:id="119" w:name="taşmayı-kim-yakalar-savunma-katmanları"/>
+    <w:bookmarkEnd w:id="127"/>
+    <w:bookmarkStart w:id="128" w:name="taşmayı-kim-yakalar-savunma-katmanları"/>
     <w:p>
       <w:pPr>
         <w:pStyle w:val="Heading3"/>
@@ -31297,8 +31087,8 @@
         <w:t xml:space="preserve">akışı ele geçiremese bile programı çökertebilir. Bu da bir hizmet engellemedir.</w:t>
       </w:r>
     </w:p>
-    <w:bookmarkEnd w:id="119"/>
-    <w:bookmarkStart w:id="120" w:name="X91978f18fb9ce816c50728c04f1964681574400"/>
+    <w:bookmarkEnd w:id="128"/>
+    <w:bookmarkStart w:id="129" w:name="X91978f18fb9ce816c50728c04f1964681574400"/>
     <w:p>
       <w:pPr>
         <w:pStyle w:val="Heading3"/>
@@ -31740,9 +31530,9 @@
         </w:pict>
       </w:r>
     </w:p>
-    <w:bookmarkEnd w:id="120"/>
-    <w:bookmarkEnd w:id="121"/>
-    <w:bookmarkStart w:id="122" w:name="Xa9a21895cb0d3f8313e853f108aa26db7260203"/>
+    <w:bookmarkEnd w:id="129"/>
+    <w:bookmarkEnd w:id="130"/>
+    <w:bookmarkStart w:id="131" w:name="Xa9a21895cb0d3f8313e853f108aa26db7260203"/>
     <w:p>
       <w:pPr>
         <w:pStyle w:val="Heading2"/>
@@ -34176,8 +33966,8 @@
         </w:pict>
       </w:r>
     </w:p>
-    <w:bookmarkEnd w:id="122"/>
-    <w:bookmarkStart w:id="124" w:name="tamsayılar-ve-işaretli-uzunluk-hatası"/>
+    <w:bookmarkEnd w:id="131"/>
+    <w:bookmarkStart w:id="133" w:name="tamsayılar-ve-işaretli-uzunluk-hatası"/>
     <w:p>
       <w:pPr>
         <w:pStyle w:val="Heading2"/>
@@ -34375,7 +34165,7 @@
         <w:t xml:space="preserve">onlara geçtiği anda dev bir sayıya dönüşür.</w:t>
       </w:r>
     </w:p>
-    <w:bookmarkStart w:id="123" w:name="demo-4-işaretli-uzunluk-hatası"/>
+    <w:bookmarkStart w:id="132" w:name="demo-4-işaretli-uzunluk-hatası"/>
     <w:p>
       <w:pPr>
         <w:pStyle w:val="Heading3"/>
@@ -36226,9 +36016,9 @@
         </w:pict>
       </w:r>
     </w:p>
-    <w:bookmarkEnd w:id="123"/>
-    <w:bookmarkEnd w:id="124"/>
-    <w:bookmarkStart w:id="137" w:name="bellek-yönetimi-ve-güvenlik"/>
+    <w:bookmarkEnd w:id="132"/>
+    <w:bookmarkEnd w:id="133"/>
+    <w:bookmarkStart w:id="146" w:name="bellek-yönetimi-ve-güvenlik"/>
     <w:p>
       <w:pPr>
         <w:pStyle w:val="Heading2"/>
@@ -36321,7 +36111,7 @@
         <w:t xml:space="preserve">bellek, programcı serbest bırakana kadar yaşar; dil bu süreyi sizin yerinize takip etmez.</w:t>
       </w:r>
     </w:p>
-    <w:bookmarkStart w:id="128" w:name="belleğin-dört-ömrü"/>
+    <w:bookmarkStart w:id="137" w:name="belleğin-dört-ömrü"/>
     <w:p>
       <w:pPr>
         <w:pStyle w:val="Heading3"/>
@@ -36701,18 +36491,18 @@
           <wp:inline>
             <wp:extent cx="5759999" cy="2748610"/>
             <wp:effectExtent b="0" l="0" r="0" t="0"/>
-            <wp:docPr descr="Belleğin altı adımı ve her adımın CWE karşılığı" title="" id="126" name="Picture"/>
+            <wp:docPr descr="Belleğin altı adımı ve her adımın CWE karşılığı" title="" id="135" name="Picture"/>
             <a:graphic>
               <a:graphicData uri="http://schemas.openxmlformats.org/drawingml/2006/picture">
                 <pic:pic>
                   <pic:nvPicPr>
-                    <pic:cNvPr descr="h01-09-bellek-omru.png" id="127" name="Picture"/>
+                    <pic:cNvPr descr="h01-09-bellek-omru.png" id="136" name="Picture"/>
                     <pic:cNvPicPr>
                       <a:picLocks noChangeArrowheads="1" noChangeAspect="1"/>
                     </pic:cNvPicPr>
                   </pic:nvPicPr>
                   <pic:blipFill>
-                    <a:blip r:embed="rId125"/>
+                    <a:blip r:embed="rId134"/>
                     <a:stretch>
                       <a:fillRect/>
                     </a:stretch>
@@ -36739,8 +36529,8 @@
         </w:drawing>
       </w:r>
     </w:p>
-    <w:bookmarkEnd w:id="128"/>
-    <w:bookmarkStart w:id="129" w:name="hata-sınıfları"/>
+    <w:bookmarkEnd w:id="137"/>
+    <w:bookmarkStart w:id="138" w:name="hata-sınıfları"/>
     <w:p>
       <w:pPr>
         <w:pStyle w:val="Heading3"/>
@@ -37351,8 +37141,8 @@
         </w:tc>
       </w:tr>
     </w:tbl>
-    <w:bookmarkEnd w:id="129"/>
-    <w:bookmarkStart w:id="130" w:name="Xed90032340bb147b7ee09c03d7e09e7d2148220"/>
+    <w:bookmarkEnd w:id="138"/>
+    <w:bookmarkStart w:id="139" w:name="Xed90032340bb147b7ee09c03d7e09e7d2148220"/>
     <w:p>
       <w:pPr>
         <w:pStyle w:val="Heading3"/>
@@ -38187,8 +37977,8 @@
         <w:t xml:space="preserve">ödünç alır).</w:t>
       </w:r>
     </w:p>
-    <w:bookmarkEnd w:id="130"/>
-    <w:bookmarkStart w:id="131" w:name="diğer-hataların-düzeltilmiş-halleri"/>
+    <w:bookmarkEnd w:id="139"/>
+    <w:bookmarkStart w:id="140" w:name="diğer-hataların-düzeltilmiş-halleri"/>
     <w:p>
       <w:pPr>
         <w:pStyle w:val="Heading3"/>
@@ -38881,8 +38671,8 @@
         <w:t xml:space="preserve">öyle serbest bırakın.</w:t>
       </w:r>
     </w:p>
-    <w:bookmarkEnd w:id="131"/>
-    <w:bookmarkStart w:id="132" w:name="sırları-bellekten-silmek-tarif-13.2"/>
+    <w:bookmarkEnd w:id="140"/>
+    <w:bookmarkStart w:id="141" w:name="sırları-bellekten-silmek-tarif-13.2"/>
     <w:p>
       <w:pPr>
         <w:pStyle w:val="Heading3"/>
@@ -40009,8 +39799,8 @@
         <w:t xml:space="preserve">silindiğini gösterecek kadar ayrıntılı yazılır.</w:t>
       </w:r>
     </w:p>
-    <w:bookmarkEnd w:id="132"/>
-    <w:bookmarkStart w:id="133" w:name="Xc9727b4616c6f3a4e20a0c6c4688f61b9eeaf46"/>
+    <w:bookmarkEnd w:id="141"/>
+    <w:bookmarkStart w:id="142" w:name="Xc9727b4616c6f3a4e20a0c6c4688f61b9eeaf46"/>
     <w:p>
       <w:pPr>
         <w:pStyle w:val="Heading3"/>
@@ -40749,8 +40539,8 @@
         <w:t xml:space="preserve">tutan küçük ve ayrı bir bölgeyi kilitleyin.</w:t>
       </w:r>
     </w:p>
-    <w:bookmarkEnd w:id="133"/>
-    <w:bookmarkStart w:id="134" w:name="hepsi-bir-arada-güvenli-tampon"/>
+    <w:bookmarkEnd w:id="142"/>
+    <w:bookmarkStart w:id="143" w:name="hepsi-bir-arada-güvenli-tampon"/>
     <w:p>
       <w:pPr>
         <w:pStyle w:val="Heading3"/>
@@ -42869,8 +42659,8 @@
         <w:t xml:space="preserve">serbest bırakır; sırlar için yukarıdaki gibi özel bir tür gerekir.</w:t>
       </w:r>
     </w:p>
-    <w:bookmarkEnd w:id="134"/>
-    <w:bookmarkStart w:id="135" w:name="bellek-hatalarını-bulan-araçlar"/>
+    <w:bookmarkEnd w:id="143"/>
+    <w:bookmarkStart w:id="144" w:name="bellek-hatalarını-bulan-araçlar"/>
     <w:p>
       <w:pPr>
         <w:pStyle w:val="Heading3"/>
@@ -43312,8 +43102,8 @@
         <w:t xml:space="preserve">ve değerle geçirilen yapılar görmek istemez.</w:t>
       </w:r>
     </w:p>
-    <w:bookmarkEnd w:id="135"/>
-    <w:bookmarkStart w:id="136" w:name="kendini-dene-bellek"/>
+    <w:bookmarkEnd w:id="144"/>
+    <w:bookmarkStart w:id="145" w:name="kendini-dene-bellek"/>
     <w:p>
       <w:pPr>
         <w:pStyle w:val="Heading3"/>
@@ -43570,9 +43360,9 @@
         </w:pict>
       </w:r>
     </w:p>
-    <w:bookmarkEnd w:id="136"/>
-    <w:bookmarkEnd w:id="137"/>
-    <w:bookmarkStart w:id="147" w:name="X567ca635338bf14ce47b4b656b0db82659ff15b"/>
+    <w:bookmarkEnd w:id="145"/>
+    <w:bookmarkEnd w:id="146"/>
+    <w:bookmarkStart w:id="159" w:name="X567ca635338bf14ce47b4b656b0db82659ff15b"/>
     <w:p>
       <w:pPr>
         <w:pStyle w:val="Heading2"/>
@@ -43671,7 +43461,7 @@
         <w:t xml:space="preserve">bulunmamasını sağlamaktır.</w:t>
       </w:r>
     </w:p>
-    <w:bookmarkStart w:id="141" w:name="Xef79e8b2c4062dcac0eb0f82d5092fce7f8d89c"/>
+    <w:bookmarkStart w:id="150" w:name="Xef79e8b2c4062dcac0eb0f82d5092fce7f8d89c"/>
     <w:p>
       <w:pPr>
         <w:pStyle w:val="Heading3"/>
@@ -43800,18 +43590,18 @@
           <wp:inline>
             <wp:extent cx="5759999" cy="2470728"/>
             <wp:effectExtent b="0" l="0" r="0" t="0"/>
-            <wp:docPr descr="Genel bölge ile korunan çekirdeğin ayrılması" title="" id="139" name="Picture"/>
+            <wp:docPr descr="Genel bölge ile korunan çekirdeğin ayrılması" title="" id="148" name="Picture"/>
             <a:graphic>
               <a:graphicData uri="http://schemas.openxmlformats.org/drawingml/2006/picture">
                 <pic:pic>
                   <pic:nvPicPr>
-                    <pic:cNvPr descr="h01-10-bolumleme.png" id="140" name="Picture"/>
+                    <pic:cNvPr descr="h01-10-bolumleme.png" id="149" name="Picture"/>
                     <pic:cNvPicPr>
                       <a:picLocks noChangeArrowheads="1" noChangeAspect="1"/>
                     </pic:cNvPicPr>
                   </pic:nvPicPr>
                   <pic:blipFill>
-                    <a:blip r:embed="rId138"/>
+                    <a:blip r:embed="rId147"/>
                     <a:stretch>
                       <a:fillRect/>
                     </a:stretch>
@@ -43838,8 +43628,8 @@
         </w:drawing>
       </w:r>
     </w:p>
-    <w:bookmarkEnd w:id="141"/>
-    <w:bookmarkStart w:id="142" w:name="bölümleme-seçenekleri"/>
+    <w:bookmarkEnd w:id="150"/>
+    <w:bookmarkStart w:id="151" w:name="bölümleme-seçenekleri"/>
     <w:p>
       <w:pPr>
         <w:pStyle w:val="Heading3"/>
@@ -44288,8 +44078,8 @@
         <w:t xml:space="preserve">denetler.</w:t>
       </w:r>
     </w:p>
-    <w:bookmarkEnd w:id="142"/>
-    <w:bookmarkStart w:id="143" w:name="Xd740b507317a4fb3c03ba9e00ee3fb796d8c45e"/>
+    <w:bookmarkEnd w:id="151"/>
+    <w:bookmarkStart w:id="152" w:name="Xd740b507317a4fb3c03ba9e00ee3fb796d8c45e"/>
     <w:p>
       <w:pPr>
         <w:pStyle w:val="Heading3"/>
@@ -45327,8 +45117,8 @@
         <w:t xml:space="preserve">önler, saldırganı değil. Saldırgana karşı ek katmanlar gerekir.</w:t>
       </w:r>
     </w:p>
-    <w:bookmarkEnd w:id="143"/>
-    <w:bookmarkStart w:id="144" w:name="Xb0ff36cd7df7fcd6b6edbba57213ddd88ec8c95"/>
+    <w:bookmarkEnd w:id="152"/>
+    <w:bookmarkStart w:id="153" w:name="Xb0ff36cd7df7fcd6b6edbba57213ddd88ec8c95"/>
     <w:p>
       <w:pPr>
         <w:pStyle w:val="Heading3"/>
@@ -45810,8 +45600,8 @@
         <w:t xml:space="preserve">der. Her kuruluma ya da cihaza özgü anahtarlar bu gereksinimin cevabıdır.</w:t>
       </w:r>
     </w:p>
-    <w:bookmarkEnd w:id="144"/>
-    <w:bookmarkStart w:id="145" w:name="Xa63a07da3d95f96750a885ba08619ea73f707c4"/>
+    <w:bookmarkEnd w:id="153"/>
+    <w:bookmarkStart w:id="157" w:name="Xa63a07da3d95f96750a885ba08619ea73f707c4"/>
     <w:p>
       <w:pPr>
         <w:pStyle w:val="Heading3"/>
@@ -45906,69 +45696,54 @@
     </w:p>
     <w:p>
       <w:pPr>
-        <w:pStyle w:val="SourceCode"/>
-      </w:pPr>
-      <w:r>
-        <w:rPr>
-          <w:rStyle w:val="VerbatimChar"/>
-        </w:rPr>
-        <w:t xml:space="preserve">  zaman ─────────────────────────────────────────────────────────────▶</w:t>
-      </w:r>
-      <w:r>
-        <w:br/>
-      </w:r>
-      <w:r>
-        <w:br/>
-      </w:r>
-      <w:r>
-        <w:rPr>
-          <w:rStyle w:val="VerbatimChar"/>
-        </w:rPr>
-        <w:t xml:space="preserve">  Kötü tasarım:  [ açılış ] ████████████████████████████████████████ [ kapanış ]</w:t>
-      </w:r>
-      <w:r>
-        <w:br/>
-      </w:r>
-      <w:r>
-        <w:rPr>
-          <w:rStyle w:val="VerbatimChar"/>
-        </w:rPr>
-        <w:t xml:space="preserve">                  anahtar uygulama açıldığında çözülür, kapanana kadar açık kalır</w:t>
-      </w:r>
-      <w:r>
-        <w:br/>
-      </w:r>
-      <w:r>
-        <w:br/>
-      </w:r>
-      <w:r>
-        <w:rPr>
-          <w:rStyle w:val="VerbatimChar"/>
-        </w:rPr>
-        <w:t xml:space="preserve">  İyi tasarım:   [ açılış ] ░░░░░░░░██░░░░░░░░░░░░██░░░░░░░░░░░░░██░ [ kapanış ]</w:t>
-      </w:r>
-      <w:r>
-        <w:br/>
-      </w:r>
-      <w:r>
-        <w:rPr>
-          <w:rStyle w:val="VerbatimChar"/>
-        </w:rPr>
-        <w:t xml:space="preserve">                  anahtar yalnız her işlemin birkaç milisaniyesinde açık (██),</w:t>
-      </w:r>
-      <w:r>
-        <w:br/>
-      </w:r>
-      <w:r>
-        <w:rPr>
-          <w:rStyle w:val="VerbatimChar"/>
-        </w:rPr>
-        <w:t xml:space="preserve">                  arada şifreli ya da parçalanmış (░)</w:t>
-      </w:r>
-    </w:p>
-    <w:p>
-      <w:pPr>
-        <w:pStyle w:val="FirstParagraph"/>
+        <w:pStyle w:val="BodyText"/>
+      </w:pPr>
+      <w:r>
+        <w:drawing>
+          <wp:inline>
+            <wp:extent cx="5759999" cy="2283460"/>
+            <wp:effectExtent b="0" l="0" r="0" t="0"/>
+            <wp:docPr descr="Anahtarın bellekte açık kaldığı sürenin iki tasarımda karşılaştırması" title="" id="155" name="Picture"/>
+            <a:graphic>
+              <a:graphicData uri="http://schemas.openxmlformats.org/drawingml/2006/picture">
+                <pic:pic>
+                  <pic:nvPicPr>
+                    <pic:cNvPr descr="h01-16-aciklik-penceresi.png" id="156" name="Picture"/>
+                    <pic:cNvPicPr>
+                      <a:picLocks noChangeArrowheads="1" noChangeAspect="1"/>
+                    </pic:cNvPicPr>
+                  </pic:nvPicPr>
+                  <pic:blipFill>
+                    <a:blip r:embed="rId154"/>
+                    <a:stretch>
+                      <a:fillRect/>
+                    </a:stretch>
+                  </pic:blipFill>
+                  <pic:spPr bwMode="auto">
+                    <a:xfrm>
+                      <a:off x="0" y="0"/>
+                      <a:ext cx="5759999" cy="2283460"/>
+                    </a:xfrm>
+                    <a:prstGeom prst="rect">
+                      <a:avLst/>
+                    </a:prstGeom>
+                    <a:noFill/>
+                    <a:ln w="9525">
+                      <a:noFill/>
+                      <a:headEnd/>
+                      <a:tailEnd/>
+                    </a:ln>
+                  </pic:spPr>
+                </pic:pic>
+              </a:graphicData>
+            </a:graphic>
+          </wp:inline>
+        </w:drawing>
+      </w:r>
+    </w:p>
+    <w:p>
+      <w:pPr>
+        <w:pStyle w:val="BodyText"/>
       </w:pPr>
       <w:r>
         <w:t xml:space="preserve">Bunu sağlayan teknikler:</w:t>
@@ -47244,8 +47019,8 @@
         <w:t xml:space="preserve">cihaza kopyalanan veri anlamsızlaşır.</w:t>
       </w:r>
     </w:p>
-    <w:bookmarkEnd w:id="145"/>
-    <w:bookmarkStart w:id="146" w:name="bölümlemenin-sınırları"/>
+    <w:bookmarkEnd w:id="157"/>
+    <w:bookmarkStart w:id="158" w:name="bölümlemenin-sınırları"/>
     <w:p>
       <w:pPr>
         <w:pStyle w:val="Heading3"/>
@@ -47381,9 +47156,9 @@
         </w:pict>
       </w:r>
     </w:p>
-    <w:bookmarkEnd w:id="146"/>
-    <w:bookmarkEnd w:id="147"/>
-    <w:bookmarkStart w:id="157" w:name="güvenli-geliştirme-süreci-planı-yaşatmak"/>
+    <w:bookmarkEnd w:id="158"/>
+    <w:bookmarkEnd w:id="159"/>
+    <w:bookmarkStart w:id="169" w:name="güvenli-geliştirme-süreci-planı-yaşatmak"/>
     <w:p>
       <w:pPr>
         <w:pStyle w:val="Heading2"/>
@@ -47434,7 +47209,7 @@
         <w:t xml:space="preserve">kendisi kadar incelenir.</w:t>
       </w:r>
     </w:p>
-    <w:bookmarkStart w:id="148" w:name="güvenli-yazılım-geliştirme-yaşam-döngüsü"/>
+    <w:bookmarkStart w:id="160" w:name="güvenli-yazılım-geliştirme-yaşam-döngüsü"/>
     <w:p>
       <w:pPr>
         <w:pStyle w:val="Heading3"/>
@@ -47734,8 +47509,8 @@
         </w:tc>
       </w:tr>
     </w:tbl>
-    <w:bookmarkEnd w:id="148"/>
-    <w:bookmarkStart w:id="149" w:name="X82b3f6015b978d712957e767bb9d7cffaf4aadc"/>
+    <w:bookmarkEnd w:id="160"/>
+    <w:bookmarkStart w:id="161" w:name="X82b3f6015b978d712957e767bb9d7cffaf4aadc"/>
     <w:p>
       <w:pPr>
         <w:pStyle w:val="Heading3"/>
@@ -48488,8 +48263,8 @@
         <w:t xml:space="preserve">anahtarlarını çözemez. Sürüm kimliği bu şekilde bir güvenlik önlemine dönüşür.</w:t>
       </w:r>
     </w:p>
-    <w:bookmarkEnd w:id="149"/>
-    <w:bookmarkStart w:id="153" w:name="değişiklik-yönetimi-yedi-adım"/>
+    <w:bookmarkEnd w:id="161"/>
+    <w:bookmarkStart w:id="165" w:name="değişiklik-yönetimi-yedi-adım"/>
     <w:p>
       <w:pPr>
         <w:pStyle w:val="Heading3"/>
@@ -48533,18 +48308,18 @@
           <wp:inline>
             <wp:extent cx="5759999" cy="2748610"/>
             <wp:effectExtent b="0" l="0" r="0" t="0"/>
-            <wp:docPr descr="Değişiklik yönetiminin yedi adımı ve yeni temel çizgi döngüsü" title="" id="151" name="Picture"/>
+            <wp:docPr descr="Değişiklik yönetiminin yedi adımı ve yeni temel çizgi döngüsü" title="" id="163" name="Picture"/>
             <a:graphic>
               <a:graphicData uri="http://schemas.openxmlformats.org/drawingml/2006/picture">
                 <pic:pic>
                   <pic:nvPicPr>
-                    <pic:cNvPr descr="h01-11-degisiklik-yonetimi.png" id="152" name="Picture"/>
+                    <pic:cNvPr descr="h01-11-degisiklik-yonetimi.png" id="164" name="Picture"/>
                     <pic:cNvPicPr>
                       <a:picLocks noChangeArrowheads="1" noChangeAspect="1"/>
                     </pic:cNvPicPr>
                   </pic:nvPicPr>
                   <pic:blipFill>
-                    <a:blip r:embed="rId150"/>
+                    <a:blip r:embed="rId162"/>
                     <a:stretch>
                       <a:fillRect/>
                     </a:stretch>
@@ -48785,8 +48560,8 @@
         <w:t xml:space="preserve">hedef alır.</w:t>
       </w:r>
     </w:p>
-    <w:bookmarkEnd w:id="153"/>
-    <w:bookmarkStart w:id="154" w:name="X40f9c30998953041f08cd7e675fd6b44dafde59"/>
+    <w:bookmarkEnd w:id="165"/>
+    <w:bookmarkStart w:id="166" w:name="X40f9c30998953041f08cd7e675fd6b44dafde59"/>
     <w:p>
       <w:pPr>
         <w:pStyle w:val="Heading3"/>
@@ -49194,8 +48969,8 @@
         <w:t xml:space="preserve">yazıldığında savunulabilir; yazılmadığında bir bulgudur.</w:t>
       </w:r>
     </w:p>
-    <w:bookmarkEnd w:id="154"/>
-    <w:bookmarkStart w:id="155" w:name="korumaların-derleme-hattına-etkisi"/>
+    <w:bookmarkEnd w:id="166"/>
+    <w:bookmarkStart w:id="167" w:name="korumaların-derleme-hattına-etkisi"/>
     <w:p>
       <w:pPr>
         <w:pStyle w:val="Heading3"/>
@@ -49280,8 +49055,8 @@
         <w:t xml:space="preserve">bir örnekle kuracağız.</w:t>
       </w:r>
     </w:p>
-    <w:bookmarkEnd w:id="155"/>
-    <w:bookmarkStart w:id="156" w:name="korumaların-maliyetini-ölçmek"/>
+    <w:bookmarkEnd w:id="167"/>
+    <w:bookmarkStart w:id="168" w:name="korumaların-maliyetini-ölçmek"/>
     <w:p>
       <w:pPr>
         <w:pStyle w:val="Heading3"/>
@@ -49348,9 +49123,9 @@
         </w:pict>
       </w:r>
     </w:p>
-    <w:bookmarkEnd w:id="156"/>
-    <w:bookmarkEnd w:id="157"/>
-    <w:bookmarkStart w:id="158" w:name="bu-haftanın-araç-kutusu"/>
+    <w:bookmarkEnd w:id="168"/>
+    <w:bookmarkEnd w:id="169"/>
+    <w:bookmarkStart w:id="170" w:name="bu-haftanın-araç-kutusu"/>
     <w:p>
       <w:pPr>
         <w:pStyle w:val="Heading2"/>
@@ -50248,8 +50023,8 @@
         </w:pict>
       </w:r>
     </w:p>
-    <w:bookmarkEnd w:id="158"/>
-    <w:bookmarkStart w:id="159" w:name="dönem-projesi-bu-hafta"/>
+    <w:bookmarkEnd w:id="170"/>
+    <w:bookmarkStart w:id="171" w:name="dönem-projesi-bu-hafta"/>
     <w:p>
       <w:pPr>
         <w:pStyle w:val="Heading2"/>
@@ -50800,8 +50575,8 @@
         </w:pict>
       </w:r>
     </w:p>
-    <w:bookmarkEnd w:id="159"/>
-    <w:bookmarkStart w:id="160" w:name="kendi-başına-çalış"/>
+    <w:bookmarkEnd w:id="171"/>
+    <w:bookmarkStart w:id="172" w:name="kendi-başına-çalış"/>
     <w:p>
       <w:pPr>
         <w:pStyle w:val="Heading2"/>
@@ -52809,8 +52584,8 @@
         </w:pict>
       </w:r>
     </w:p>
-    <w:bookmarkEnd w:id="160"/>
-    <w:bookmarkStart w:id="161" w:name="kendini-sınama"/>
+    <w:bookmarkEnd w:id="172"/>
+    <w:bookmarkStart w:id="173" w:name="kendini-sınama"/>
     <w:p>
       <w:pPr>
         <w:pStyle w:val="Heading2"/>
@@ -54309,8 +54084,8 @@
         </w:pict>
       </w:r>
     </w:p>
-    <w:bookmarkEnd w:id="161"/>
-    <w:bookmarkStart w:id="162" w:name="kaynaklar-ve-ileri-okuma"/>
+    <w:bookmarkEnd w:id="173"/>
+    <w:bookmarkStart w:id="174" w:name="kaynaklar-ve-ileri-okuma"/>
     <w:p>
       <w:pPr>
         <w:pStyle w:val="Heading2"/>
@@ -54975,8 +54750,8 @@
         </w:tc>
       </w:tr>
     </w:tbl>
-    <w:bookmarkEnd w:id="162"/>
-    <w:bookmarkEnd w:id="163"/>
+    <w:bookmarkEnd w:id="174"/>
+    <w:bookmarkEnd w:id="175"/>
     <w:sectPr>
       <w:headerReference r:id="rId9" w:type="default"/>
       <w:footerReference r:id="rId10" w:type="default"/>

</xml_diff>